<commit_message>
Add LigandMPNN reference to manuscript References list
Dauparas et al., Nature Methods 22, 717-723 (2025), DOI:
10.1038/s41592-025-02626-1 -- was cited by name throughout Sections
2.3/2.5/3.3 and the Abstract but never had its own entry (was still a
bioRxiv preprint when the reference list was built). Inserted after the
RFdiffusion3/Butcher entry, before OpenFold3-preview, grouping the
design-tool citations together. Single-reference addition only, docx
edited surgically (172->173 paragraphs, validated) and markdown
extraction updated to match; no other content touched.

Co-Authored-By: Claude Sonnet 5 <noreply@anthropic.com>
</commit_message>
<xml_diff>
--- a/paper/manuscript_final.docx
+++ b/paper/manuscript_final.docx
@@ -3359,6 +3359,29 @@
       </w:r>
       <w:r>
         <w:t xml:space="preserve"> 2025.09.18.676967 (2025). DOI: 10.1101/2025.09.18.676967. [Preprint.]</w:t>
+      </w:r>
+    </w:p>
+    <w:p>
+      <w:pPr>
+        <w:pStyle w:val="ListParagraph"/>
+        <w:numPr>
+          <w:ilvl w:val="0"/>
+          <w:numId w:val="3"/>
+        </w:numPr>
+        <w:spacing w:after="160" w:line="276"/>
+      </w:pPr>
+      <w:r>
+        <w:t xml:space="preserve">Dauparas, J., Lee, G.R., Pecoraro, R., An, L., Anishchenko, I., Glasscock, C. &amp; Baker, D. Atomic context-conditioned protein sequence design using LigandMPNN. </w:t>
+      </w:r>
+      <w:r>
+        <w:rPr>
+          <w:i/>
+          <w:iCs/>
+        </w:rPr>
+        <w:t xml:space="preserve">Nature Methods</w:t>
+      </w:r>
+      <w:r>
+        <w:t xml:space="preserve"> 22, 717–723 (2025). DOI: 10.1038/s41592-025-02626-1.</w:t>
       </w:r>
     </w:p>
     <w:p>

</xml_diff>